<commit_message>
Add MPLY coverage to Article 003 (Second Mover Advantage)
The brief tagged this row Indirect/Omit, but the article's own "When Being
Second Does Not Work" section already discusses network effects, switching
costs, patents, and regulatory approvals as what blocks a second mover from
overtaking a pioneer -- the same category of durable barrier MPLY's own
screen is built to identify. That's a genuine, specific connection tied
directly to content already in the article, not a forced one, so it earned
a brief contextual paragraph with the official MPLY link. Word count
813, still 0 em dashes, hashtags still the final content.

Co-Authored-By: Claude Sonnet 5 <noreply@anthropic.com>
</commit_message>
<xml_diff>
--- a/Articles/2026-09-28_Set_01/003_What_Is_a_Second_Mover_Advantage.docx
+++ b/Articles/2026-09-28_Set_01/003_What_Is_a_Second_Mover_Advantage.docx
@@ -248,6 +248,57 @@
           <w:sz w:val="23"/>
           <w:szCs w:val="23"/>
         </w:rPr>
+        <w:t xml:space="preserve">That same list, network effects, switching costs, patents, regulatory approvals, is close to what the Strategy Shares Monopoly ETF (</w:t>
+      </w:r>
+      <w:r>
+        <w:rPr>
+          <w:rFonts w:ascii="Georgia" w:cs="Georgia" w:eastAsia="Georgia" w:hAnsi="Georgia"/>
+          <w:b/>
+          <w:bCs/>
+          <w:sz w:val="23"/>
+          <w:szCs w:val="23"/>
+        </w:rPr>
+        <w:t xml:space="preserve">MPLY</w:t>
+      </w:r>
+      <w:r>
+        <w:rPr>
+          <w:rFonts w:ascii="Georgia" w:cs="Georgia" w:eastAsia="Georgia" w:hAnsi="Georgia"/>
+          <w:sz w:val="23"/>
+          <w:szCs w:val="23"/>
+        </w:rPr>
+        <w:t xml:space="preserve">) screens for when it evaluates whether a company's market position is durable rather than temporary. The fund's process is not concerned with who entered a market first; it is concerned with whether a company's current position would actually survive a well-executed challenger, which is the same question this section is really asking about any pioneer facing a second mover. Readers interested in how a fund weighs that kind of durability can review </w:t>
+      </w:r>
+      <w:hyperlink w:history="1" r:id="rIdmfvgcqsrx-3xhe3lz5rxk">
+        <w:r>
+          <w:rPr>
+            <w:rFonts w:ascii="Georgia" w:cs="Georgia" w:eastAsia="Georgia" w:hAnsi="Georgia"/>
+            <w:color w:val="1155CC"/>
+            <w:sz w:val="23"/>
+            <w:szCs w:val="23"/>
+            <w:u w:val="single"/>
+          </w:rPr>
+          <w:t xml:space="preserve">MPLY's investment approach</w:t>
+        </w:r>
+      </w:hyperlink>
+      <w:r>
+        <w:rPr>
+          <w:rFonts w:ascii="Georgia" w:cs="Georgia" w:eastAsia="Georgia" w:hAnsi="Georgia"/>
+          <w:sz w:val="23"/>
+          <w:szCs w:val="23"/>
+        </w:rPr>
+        <w:t xml:space="preserve"> on the fund's official page.</w:t>
+      </w:r>
+    </w:p>
+    <w:p>
+      <w:pPr>
+        <w:spacing w:after="200"/>
+      </w:pPr>
+      <w:r>
+        <w:rPr>
+          <w:rFonts w:ascii="Georgia" w:cs="Georgia" w:eastAsia="Georgia" w:hAnsi="Georgia"/>
+          <w:sz w:val="23"/>
+          <w:szCs w:val="23"/>
+        </w:rPr>
         <w:t xml:space="preserve">The practical takeaway is that neither position, first or second, guarantees success. What tends to matter more is execution: whether a company can turn the lessons of an earlier entrant, or the ground that entrant already broke, into a genuinely better product, and whether the market's dynamics (network effects, switching costs, patents) leave room for a later arrival to catch up at all.</w:t>
       </w:r>
     </w:p>

</xml_diff>